<commit_message>
Restructure 3MF editor (#15)
* Reorganize

* First project structure

* Delete .project

* git ignore

* Delete 3MF_Editor_Guide_v1_00.pdf

* bin in .gitignore

* move guide to resources

* license and code of conduct

* fixed readme

* readme.md

* vscode config

* remove *.bak

* cleanup jar executable

* Update README.md

* VSCODE and CLI instructions

* Update README.md

* Update README.md

* Update README.md

* Update README.md

* Update README.md

* Update docs

* Update README.md

* Cleanup cliResults and update schema

* Add additional test files

* Update README.md

* Update README.md

* Rename file

* Update README.md

* Update 3MF Editor Build Instructions for VSCode.docx

* Update documentation

* Create LICENSE-2.0.txt

* Create build.yml

* Update build.yml

* Update ZipFileUtil.java

* Create code-validation.yml

* Update code-validation.yml

* Update code-validation.yml

* Build a self cointaiend jar file

* Delete j3dcore-ogl.dll

* Fix for veracode
</commit_message>
<xml_diff>
--- a/CLI_Interface/Docs/3MF Editor CLI User Guide.docx
+++ b/CLI_Interface/Docs/3MF Editor CLI User Guide.docx
@@ -1,7 +1,224 @@
 
 <file path=word/document.xml><?xml version="1.0" encoding="utf-8"?>
-<w:document xmlns:wpc="http://schemas.microsoft.com/office/word/2010/wordprocessingCanvas" xmlns:cx="http://schemas.microsoft.com/office/drawing/2014/chartex" xmlns:cx1="http://schemas.microsoft.com/office/drawing/2015/9/8/chartex" xmlns:cx2="http://schemas.microsoft.com/office/drawing/2015/10/21/chartex" xmlns:cx3="http://schemas.microsoft.com/office/drawing/2016/5/9/chartex" xmlns:cx4="http://schemas.microsoft.com/office/drawing/2016/5/10/chartex" xmlns:cx5="http://schemas.microsoft.com/office/drawing/2016/5/11/chartex" xmlns:cx6="http://schemas.microsoft.com/office/drawing/2016/5/12/chartex" xmlns:cx7="http://schemas.microsoft.com/office/drawing/2016/5/13/chartex" xmlns:cx8="http://schemas.microsoft.com/office/drawing/2016/5/14/chartex" xmlns:mc="http://schemas.openxmlformats.org/markup-compatibility/2006" xmlns:aink="http://schemas.microsoft.com/office/drawing/2016/ink" xmlns:am3d="http://schemas.microsoft.com/office/drawing/2017/model3d" xmlns:o="urn:schemas-microsoft-com:office:office" xmlns:r="http://schemas.openxmlformats.org/officeDocument/2006/relationships" xmlns:m="http://schemas.openxmlformats.org/officeDocument/2006/math" xmlns:v="urn:schemas-microsoft-com:vml" xmlns:wp14="http://schemas.microsoft.com/office/word/2010/wordprocessingDrawing" xmlns:wp="http://schemas.openxmlformats.org/drawingml/2006/wordprocessingDrawing" xmlns:w10="urn:schemas-microsoft-com:office:word" xmlns:w="http://schemas.openxmlformats.org/wordprocessingml/2006/main" xmlns:w14="http://schemas.microsoft.com/office/word/2010/wordml" xmlns:w15="http://schemas.microsoft.com/office/word/2012/wordml" xmlns:w16cex="http://schemas.microsoft.com/office/word/2018/wordml/cex" xmlns:w16cid="http://schemas.microsoft.com/office/word/2016/wordml/cid" xmlns:w16="http://schemas.microsoft.com/office/word/2018/wordml" xmlns:w16sdtdh="http://schemas.microsoft.com/office/word/2020/wordml/sdtdatahash" xmlns:w16se="http://schemas.microsoft.com/office/word/2015/wordml/symex" xmlns:wpg="http://schemas.microsoft.com/office/word/2010/wordprocessingGroup" xmlns:wpi="http://schemas.microsoft.com/office/word/2010/wordprocessingInk" xmlns:wne="http://schemas.microsoft.com/office/word/2006/wordml" xmlns:wps="http://schemas.microsoft.com/office/word/2010/wordprocessingShape" mc:Ignorable="w14 w15 w16se w16cid w16 w16cex w16sdtdh wp14">
+<w:document xmlns:wpc="http://schemas.microsoft.com/office/word/2010/wordprocessingCanvas" xmlns:cx="http://schemas.microsoft.com/office/drawing/2014/chartex" xmlns:cx1="http://schemas.microsoft.com/office/drawing/2015/9/8/chartex" xmlns:cx2="http://schemas.microsoft.com/office/drawing/2015/10/21/chartex" xmlns:cx3="http://schemas.microsoft.com/office/drawing/2016/5/9/chartex" xmlns:cx4="http://schemas.microsoft.com/office/drawing/2016/5/10/chartex" xmlns:cx5="http://schemas.microsoft.com/office/drawing/2016/5/11/chartex" xmlns:cx6="http://schemas.microsoft.com/office/drawing/2016/5/12/chartex" xmlns:cx7="http://schemas.microsoft.com/office/drawing/2016/5/13/chartex" xmlns:cx8="http://schemas.microsoft.com/office/drawing/2016/5/14/chartex" xmlns:mc="http://schemas.openxmlformats.org/markup-compatibility/2006" xmlns:aink="http://schemas.microsoft.com/office/drawing/2016/ink" xmlns:am3d="http://schemas.microsoft.com/office/drawing/2017/model3d" xmlns:o="urn:schemas-microsoft-com:office:office" xmlns:oel="http://schemas.microsoft.com/office/2019/extlst" xmlns:r="http://schemas.openxmlformats.org/officeDocument/2006/relationships" xmlns:m="http://schemas.openxmlformats.org/officeDocument/2006/math" xmlns:v="urn:schemas-microsoft-com:vml" xmlns:wp14="http://schemas.microsoft.com/office/word/2010/wordprocessingDrawing" xmlns:wp="http://schemas.openxmlformats.org/drawingml/2006/wordprocessingDrawing" xmlns:w10="urn:schemas-microsoft-com:office:word" xmlns:w="http://schemas.openxmlformats.org/wordprocessingml/2006/main" xmlns:w14="http://schemas.microsoft.com/office/word/2010/wordml" xmlns:w15="http://schemas.microsoft.com/office/word/2012/wordml" xmlns:w16cex="http://schemas.microsoft.com/office/word/2018/wordml/cex" xmlns:w16cid="http://schemas.microsoft.com/office/word/2016/wordml/cid" xmlns:w16="http://schemas.microsoft.com/office/word/2018/wordml" xmlns:w16du="http://schemas.microsoft.com/office/word/2023/wordml/word16du" xmlns:w16sdtdh="http://schemas.microsoft.com/office/word/2020/wordml/sdtdatahash" xmlns:w16sdtfl="http://schemas.microsoft.com/office/word/2024/wordml/sdtformatlock" xmlns:w16se="http://schemas.microsoft.com/office/word/2015/wordml/symex" xmlns:wpg="http://schemas.microsoft.com/office/word/2010/wordprocessingGroup" xmlns:wpi="http://schemas.microsoft.com/office/word/2010/wordprocessingInk" xmlns:wne="http://schemas.microsoft.com/office/word/2006/wordml" xmlns:wps="http://schemas.microsoft.com/office/word/2010/wordprocessingShape" mc:Ignorable="w14 w15 w16se w16cid w16 w16cex w16sdtdh w16sdtfl w16du wp14">
   <w:body>
+    <w:p>
+      <w:pPr>
+        <w:jc w:val="center"/>
+        <w:rPr>
+          <w:b/>
+          <w:bCs/>
+          <w:sz w:val="72"/>
+          <w:szCs w:val="72"/>
+        </w:rPr>
+      </w:pPr>
+      <w:bookmarkStart w:id="0" w:name="_Toc505161523"/>
+      <w:r>
+        <w:rPr>
+          <w:b/>
+          <w:bCs/>
+          <w:sz w:val="72"/>
+          <w:szCs w:val="72"/>
+        </w:rPr>
+        <w:t xml:space="preserve">3MF Editor Command Line Interface </w:t>
+      </w:r>
+    </w:p>
+    <w:p>
+      <w:pPr>
+        <w:jc w:val="center"/>
+        <w:rPr>
+          <w:sz w:val="40"/>
+          <w:szCs w:val="40"/>
+        </w:rPr>
+      </w:pPr>
+      <w:r>
+        <w:rPr>
+          <w:sz w:val="40"/>
+          <w:szCs w:val="40"/>
+        </w:rPr>
+        <w:t xml:space="preserve">Version </w:t>
+      </w:r>
+      <w:r>
+        <w:rPr>
+          <w:sz w:val="40"/>
+          <w:szCs w:val="40"/>
+        </w:rPr>
+        <w:t>1.00</w:t>
+      </w:r>
+    </w:p>
+    <w:p>
+      <w:pPr>
+        <w:jc w:val="center"/>
+      </w:pPr>
+    </w:p>
+    <w:p>
+      <w:pPr>
+        <w:jc w:val="center"/>
+      </w:pPr>
+    </w:p>
+    <w:p>
+      <w:pPr>
+        <w:jc w:val="center"/>
+      </w:pPr>
+    </w:p>
+    <w:p>
+      <w:pPr>
+        <w:jc w:val="center"/>
+      </w:pPr>
+    </w:p>
+    <w:p>
+      <w:pPr>
+        <w:jc w:val="center"/>
+      </w:pPr>
+    </w:p>
+    <w:p>
+      <w:pPr>
+        <w:jc w:val="center"/>
+      </w:pPr>
+    </w:p>
+    <w:p>
+      <w:pPr>
+        <w:jc w:val="center"/>
+      </w:pPr>
+    </w:p>
+    <w:p>
+      <w:pPr>
+        <w:jc w:val="center"/>
+      </w:pPr>
+    </w:p>
+    <w:tbl>
+      <w:tblPr>
+        <w:tblStyle w:val="TableGrid"/>
+        <w:tblW w:w="0" w:type="auto"/>
+        <w:tblLook w:val="04A0" w:firstRow="1" w:lastRow="0" w:firstColumn="1" w:lastColumn="0" w:noHBand="0" w:noVBand="1"/>
+      </w:tblPr>
+      <w:tblGrid>
+        <w:gridCol w:w="1231"/>
+        <w:gridCol w:w="6143"/>
+        <w:gridCol w:w="1976"/>
+      </w:tblGrid>
+      <w:tr>
+        <w:tc>
+          <w:tcPr>
+            <w:tcW w:w="1231" w:type="dxa"/>
+          </w:tcPr>
+          <w:p>
+            <w:pPr>
+              <w:jc w:val="center"/>
+              <w:rPr>
+                <w:b/>
+                <w:bCs/>
+              </w:rPr>
+            </w:pPr>
+            <w:r>
+              <w:rPr>
+                <w:b/>
+                <w:bCs/>
+              </w:rPr>
+              <w:t>Version</w:t>
+            </w:r>
+          </w:p>
+        </w:tc>
+        <w:tc>
+          <w:tcPr>
+            <w:tcW w:w="6143" w:type="dxa"/>
+          </w:tcPr>
+          <w:p>
+            <w:pPr>
+              <w:jc w:val="center"/>
+              <w:rPr>
+                <w:b/>
+                <w:bCs/>
+              </w:rPr>
+            </w:pPr>
+            <w:r>
+              <w:rPr>
+                <w:b/>
+                <w:bCs/>
+              </w:rPr>
+              <w:t>Changes</w:t>
+            </w:r>
+          </w:p>
+        </w:tc>
+        <w:tc>
+          <w:tcPr>
+            <w:tcW w:w="1976" w:type="dxa"/>
+          </w:tcPr>
+          <w:p>
+            <w:pPr>
+              <w:jc w:val="center"/>
+              <w:rPr>
+                <w:b/>
+                <w:bCs/>
+              </w:rPr>
+            </w:pPr>
+            <w:r>
+              <w:rPr>
+                <w:b/>
+                <w:bCs/>
+              </w:rPr>
+              <w:t>Date/Editor</w:t>
+            </w:r>
+          </w:p>
+        </w:tc>
+      </w:tr>
+      <w:tr>
+        <w:tc>
+          <w:tcPr>
+            <w:tcW w:w="1231" w:type="dxa"/>
+          </w:tcPr>
+          <w:p>
+            <w:pPr>
+              <w:jc w:val="center"/>
+              <w:rPr>
+                <w:szCs w:val="20"/>
+              </w:rPr>
+            </w:pPr>
+            <w:r>
+              <w:rPr>
+                <w:szCs w:val="20"/>
+              </w:rPr>
+              <w:t>1.0</w:t>
+            </w:r>
+          </w:p>
+        </w:tc>
+        <w:tc>
+          <w:tcPr>
+            <w:tcW w:w="6143" w:type="dxa"/>
+          </w:tcPr>
+          <w:p>
+            <w:pPr>
+              <w:pStyle w:val="ListParagraph"/>
+              <w:numPr>
+                <w:ilvl w:val="0"/>
+                <w:numId w:val="3"/>
+              </w:numPr>
+            </w:pPr>
+            <w:r>
+              <w:t>Initial Release</w:t>
+            </w:r>
+          </w:p>
+        </w:tc>
+        <w:tc>
+          <w:tcPr>
+            <w:tcW w:w="1976" w:type="dxa"/>
+          </w:tcPr>
+          <w:p>
+            <w:r>
+              <w:t>JZ – 10/1/22</w:t>
+            </w:r>
+          </w:p>
+        </w:tc>
+      </w:tr>
+    </w:tbl>
+    <w:p>
+      <w:pPr>
+        <w:jc w:val="center"/>
+      </w:pPr>
+      <w:r>
+        <w:br w:type="page"/>
+      </w:r>
+    </w:p>
     <w:p>
       <w:pPr>
         <w:keepNext/>
@@ -17,7 +234,6 @@
           <w:szCs w:val="28"/>
         </w:rPr>
       </w:pPr>
-      <w:bookmarkStart w:id="0" w:name="_Toc505161523"/>
       <w:r>
         <w:rPr>
           <w:rFonts w:ascii="Verdana" w:eastAsia="Verdana" w:hAnsi="Verdana" w:cs="Verdana"/>
@@ -27,6 +243,7 @@
           <w:sz w:val="28"/>
           <w:szCs w:val="28"/>
         </w:rPr>
+        <w:lastRenderedPageBreak/>
         <w:t>3MF Editor Command Line Interface</w:t>
       </w:r>
       <w:bookmarkEnd w:id="0"/>
@@ -2874,8 +3091,121 @@
 </file>
 
 <file path=word/numbering.xml><?xml version="1.0" encoding="utf-8"?>
-<w:numbering xmlns:wpc="http://schemas.microsoft.com/office/word/2010/wordprocessingCanvas" xmlns:cx="http://schemas.microsoft.com/office/drawing/2014/chartex" xmlns:cx1="http://schemas.microsoft.com/office/drawing/2015/9/8/chartex" xmlns:cx2="http://schemas.microsoft.com/office/drawing/2015/10/21/chartex" xmlns:cx3="http://schemas.microsoft.com/office/drawing/2016/5/9/chartex" xmlns:cx4="http://schemas.microsoft.com/office/drawing/2016/5/10/chartex" xmlns:cx5="http://schemas.microsoft.com/office/drawing/2016/5/11/chartex" xmlns:cx6="http://schemas.microsoft.com/office/drawing/2016/5/12/chartex" xmlns:cx7="http://schemas.microsoft.com/office/drawing/2016/5/13/chartex" xmlns:cx8="http://schemas.microsoft.com/office/drawing/2016/5/14/chartex" xmlns:mc="http://schemas.openxmlformats.org/markup-compatibility/2006" xmlns:aink="http://schemas.microsoft.com/office/drawing/2016/ink" xmlns:am3d="http://schemas.microsoft.com/office/drawing/2017/model3d" xmlns:o="urn:schemas-microsoft-com:office:office" xmlns:r="http://schemas.openxmlformats.org/officeDocument/2006/relationships" xmlns:m="http://schemas.openxmlformats.org/officeDocument/2006/math" xmlns:v="urn:schemas-microsoft-com:vml" xmlns:wp14="http://schemas.microsoft.com/office/word/2010/wordprocessingDrawing" xmlns:wp="http://schemas.openxmlformats.org/drawingml/2006/wordprocessingDrawing" xmlns:w10="urn:schemas-microsoft-com:office:word" xmlns:w="http://schemas.openxmlformats.org/wordprocessingml/2006/main" xmlns:w14="http://schemas.microsoft.com/office/word/2010/wordml" xmlns:w15="http://schemas.microsoft.com/office/word/2012/wordml" xmlns:w16cex="http://schemas.microsoft.com/office/word/2018/wordml/cex" xmlns:w16cid="http://schemas.microsoft.com/office/word/2016/wordml/cid" xmlns:w16="http://schemas.microsoft.com/office/word/2018/wordml" xmlns:w16sdtdh="http://schemas.microsoft.com/office/word/2020/wordml/sdtdatahash" xmlns:w16se="http://schemas.microsoft.com/office/word/2015/wordml/symex" xmlns:wpg="http://schemas.microsoft.com/office/word/2010/wordprocessingGroup" xmlns:wpi="http://schemas.microsoft.com/office/word/2010/wordprocessingInk" xmlns:wne="http://schemas.microsoft.com/office/word/2006/wordml" xmlns:wps="http://schemas.microsoft.com/office/word/2010/wordprocessingShape" mc:Ignorable="w14 w15 w16se w16cid w16 w16cex w16sdtdh wp14">
+<w:numbering xmlns:wpc="http://schemas.microsoft.com/office/word/2010/wordprocessingCanvas" xmlns:cx="http://schemas.microsoft.com/office/drawing/2014/chartex" xmlns:cx1="http://schemas.microsoft.com/office/drawing/2015/9/8/chartex" xmlns:cx2="http://schemas.microsoft.com/office/drawing/2015/10/21/chartex" xmlns:cx3="http://schemas.microsoft.com/office/drawing/2016/5/9/chartex" xmlns:cx4="http://schemas.microsoft.com/office/drawing/2016/5/10/chartex" xmlns:cx5="http://schemas.microsoft.com/office/drawing/2016/5/11/chartex" xmlns:cx6="http://schemas.microsoft.com/office/drawing/2016/5/12/chartex" xmlns:cx7="http://schemas.microsoft.com/office/drawing/2016/5/13/chartex" xmlns:cx8="http://schemas.microsoft.com/office/drawing/2016/5/14/chartex" xmlns:mc="http://schemas.openxmlformats.org/markup-compatibility/2006" xmlns:aink="http://schemas.microsoft.com/office/drawing/2016/ink" xmlns:am3d="http://schemas.microsoft.com/office/drawing/2017/model3d" xmlns:o="urn:schemas-microsoft-com:office:office" xmlns:oel="http://schemas.microsoft.com/office/2019/extlst" xmlns:r="http://schemas.openxmlformats.org/officeDocument/2006/relationships" xmlns:m="http://schemas.openxmlformats.org/officeDocument/2006/math" xmlns:v="urn:schemas-microsoft-com:vml" xmlns:wp14="http://schemas.microsoft.com/office/word/2010/wordprocessingDrawing" xmlns:wp="http://schemas.openxmlformats.org/drawingml/2006/wordprocessingDrawing" xmlns:w10="urn:schemas-microsoft-com:office:word" xmlns:w="http://schemas.openxmlformats.org/wordprocessingml/2006/main" xmlns:w14="http://schemas.microsoft.com/office/word/2010/wordml" xmlns:w15="http://schemas.microsoft.com/office/word/2012/wordml" xmlns:w16cex="http://schemas.microsoft.com/office/word/2018/wordml/cex" xmlns:w16cid="http://schemas.microsoft.com/office/word/2016/wordml/cid" xmlns:w16="http://schemas.microsoft.com/office/word/2018/wordml" xmlns:w16du="http://schemas.microsoft.com/office/word/2023/wordml/word16du" xmlns:w16sdtdh="http://schemas.microsoft.com/office/word/2020/wordml/sdtdatahash" xmlns:w16sdtfl="http://schemas.microsoft.com/office/word/2024/wordml/sdtformatlock" xmlns:w16se="http://schemas.microsoft.com/office/word/2015/wordml/symex" xmlns:wpg="http://schemas.microsoft.com/office/word/2010/wordprocessingGroup" xmlns:wpi="http://schemas.microsoft.com/office/word/2010/wordprocessingInk" xmlns:wne="http://schemas.microsoft.com/office/word/2006/wordml" xmlns:wps="http://schemas.microsoft.com/office/word/2010/wordprocessingShape" mc:Ignorable="w14 w15 w16se w16cid w16 w16cex w16sdtdh w16sdtfl w16du wp14">
   <w:abstractNum w:abstractNumId="0" w15:restartNumberingAfterBreak="0">
+    <w:nsid w:val="0AE63876"/>
+    <w:multiLevelType w:val="hybridMultilevel"/>
+    <w:tmpl w:val="C5828528"/>
+    <w:lvl w:ilvl="0" w:tplc="04090001">
+      <w:start w:val="1"/>
+      <w:numFmt w:val="bullet"/>
+      <w:lvlText w:val=""/>
+      <w:lvlJc w:val="left"/>
+      <w:pPr>
+        <w:ind w:left="630" w:hanging="360"/>
+      </w:pPr>
+      <w:rPr>
+        <w:rFonts w:ascii="Symbol" w:hAnsi="Symbol" w:hint="default"/>
+      </w:rPr>
+    </w:lvl>
+    <w:lvl w:ilvl="1" w:tplc="04090003">
+      <w:start w:val="1"/>
+      <w:numFmt w:val="bullet"/>
+      <w:lvlText w:val="o"/>
+      <w:lvlJc w:val="left"/>
+      <w:pPr>
+        <w:ind w:left="1440" w:hanging="360"/>
+      </w:pPr>
+      <w:rPr>
+        <w:rFonts w:ascii="Courier New" w:hAnsi="Courier New" w:cs="Courier New" w:hint="default"/>
+      </w:rPr>
+    </w:lvl>
+    <w:lvl w:ilvl="2" w:tplc="04090005">
+      <w:start w:val="1"/>
+      <w:numFmt w:val="bullet"/>
+      <w:lvlText w:val=""/>
+      <w:lvlJc w:val="left"/>
+      <w:pPr>
+        <w:ind w:left="2160" w:hanging="360"/>
+      </w:pPr>
+      <w:rPr>
+        <w:rFonts w:ascii="Wingdings" w:hAnsi="Wingdings" w:hint="default"/>
+      </w:rPr>
+    </w:lvl>
+    <w:lvl w:ilvl="3" w:tplc="04090001" w:tentative="1">
+      <w:start w:val="1"/>
+      <w:numFmt w:val="bullet"/>
+      <w:lvlText w:val=""/>
+      <w:lvlJc w:val="left"/>
+      <w:pPr>
+        <w:ind w:left="2880" w:hanging="360"/>
+      </w:pPr>
+      <w:rPr>
+        <w:rFonts w:ascii="Symbol" w:hAnsi="Symbol" w:hint="default"/>
+      </w:rPr>
+    </w:lvl>
+    <w:lvl w:ilvl="4" w:tplc="04090003" w:tentative="1">
+      <w:start w:val="1"/>
+      <w:numFmt w:val="bullet"/>
+      <w:lvlText w:val="o"/>
+      <w:lvlJc w:val="left"/>
+      <w:pPr>
+        <w:ind w:left="3600" w:hanging="360"/>
+      </w:pPr>
+      <w:rPr>
+        <w:rFonts w:ascii="Courier New" w:hAnsi="Courier New" w:cs="Courier New" w:hint="default"/>
+      </w:rPr>
+    </w:lvl>
+    <w:lvl w:ilvl="5" w:tplc="04090005" w:tentative="1">
+      <w:start w:val="1"/>
+      <w:numFmt w:val="bullet"/>
+      <w:lvlText w:val=""/>
+      <w:lvlJc w:val="left"/>
+      <w:pPr>
+        <w:ind w:left="4320" w:hanging="360"/>
+      </w:pPr>
+      <w:rPr>
+        <w:rFonts w:ascii="Wingdings" w:hAnsi="Wingdings" w:hint="default"/>
+      </w:rPr>
+    </w:lvl>
+    <w:lvl w:ilvl="6" w:tplc="04090001" w:tentative="1">
+      <w:start w:val="1"/>
+      <w:numFmt w:val="bullet"/>
+      <w:lvlText w:val=""/>
+      <w:lvlJc w:val="left"/>
+      <w:pPr>
+        <w:ind w:left="5040" w:hanging="360"/>
+      </w:pPr>
+      <w:rPr>
+        <w:rFonts w:ascii="Symbol" w:hAnsi="Symbol" w:hint="default"/>
+      </w:rPr>
+    </w:lvl>
+    <w:lvl w:ilvl="7" w:tplc="04090003" w:tentative="1">
+      <w:start w:val="1"/>
+      <w:numFmt w:val="bullet"/>
+      <w:lvlText w:val="o"/>
+      <w:lvlJc w:val="left"/>
+      <w:pPr>
+        <w:ind w:left="5760" w:hanging="360"/>
+      </w:pPr>
+      <w:rPr>
+        <w:rFonts w:ascii="Courier New" w:hAnsi="Courier New" w:cs="Courier New" w:hint="default"/>
+      </w:rPr>
+    </w:lvl>
+    <w:lvl w:ilvl="8" w:tplc="04090005" w:tentative="1">
+      <w:start w:val="1"/>
+      <w:numFmt w:val="bullet"/>
+      <w:lvlText w:val=""/>
+      <w:lvlJc w:val="left"/>
+      <w:pPr>
+        <w:ind w:left="6480" w:hanging="360"/>
+      </w:pPr>
+      <w:rPr>
+        <w:rFonts w:ascii="Wingdings" w:hAnsi="Wingdings" w:hint="default"/>
+      </w:rPr>
+    </w:lvl>
+  </w:abstractNum>
+  <w:abstractNum w:abstractNumId="1" w15:restartNumberingAfterBreak="0">
     <w:nsid w:val="0FED17A8"/>
     <w:multiLevelType w:val="multilevel"/>
     <w:tmpl w:val="64C077D8"/>
@@ -3024,7 +3354,7 @@
       </w:rPr>
     </w:lvl>
   </w:abstractNum>
-  <w:abstractNum w:abstractNumId="1" w15:restartNumberingAfterBreak="0">
+  <w:abstractNum w:abstractNumId="2" w15:restartNumberingAfterBreak="0">
     <w:nsid w:val="5FAF1A37"/>
     <w:multiLevelType w:val="hybridMultilevel"/>
     <w:tmpl w:val="7CC63370"/>
@@ -3137,17 +3467,20 @@
       </w:rPr>
     </w:lvl>
   </w:abstractNum>
-  <w:num w:numId="1">
+  <w:num w:numId="1" w16cid:durableId="2044091769">
+    <w:abstractNumId w:val="2"/>
+  </w:num>
+  <w:num w:numId="2" w16cid:durableId="604070990">
     <w:abstractNumId w:val="1"/>
   </w:num>
-  <w:num w:numId="2">
+  <w:num w:numId="3" w16cid:durableId="1075008583">
     <w:abstractNumId w:val="0"/>
   </w:num>
 </w:numbering>
 </file>
 
 <file path=word/styles.xml><?xml version="1.0" encoding="utf-8"?>
-<w:styles xmlns:mc="http://schemas.openxmlformats.org/markup-compatibility/2006" xmlns:r="http://schemas.openxmlformats.org/officeDocument/2006/relationships" xmlns:w="http://schemas.openxmlformats.org/wordprocessingml/2006/main" xmlns:w14="http://schemas.microsoft.com/office/word/2010/wordml" xmlns:w15="http://schemas.microsoft.com/office/word/2012/wordml" xmlns:w16cex="http://schemas.microsoft.com/office/word/2018/wordml/cex" xmlns:w16cid="http://schemas.microsoft.com/office/word/2016/wordml/cid" xmlns:w16="http://schemas.microsoft.com/office/word/2018/wordml" xmlns:w16sdtdh="http://schemas.microsoft.com/office/word/2020/wordml/sdtdatahash" xmlns:w16se="http://schemas.microsoft.com/office/word/2015/wordml/symex" mc:Ignorable="w14 w15 w16se w16cid w16 w16cex w16sdtdh">
+<w:styles xmlns:mc="http://schemas.openxmlformats.org/markup-compatibility/2006" xmlns:r="http://schemas.openxmlformats.org/officeDocument/2006/relationships" xmlns:w="http://schemas.openxmlformats.org/wordprocessingml/2006/main" xmlns:w14="http://schemas.microsoft.com/office/word/2010/wordml" xmlns:w15="http://schemas.microsoft.com/office/word/2012/wordml" xmlns:w16cex="http://schemas.microsoft.com/office/word/2018/wordml/cex" xmlns:w16cid="http://schemas.microsoft.com/office/word/2016/wordml/cid" xmlns:w16="http://schemas.microsoft.com/office/word/2018/wordml" xmlns:w16du="http://schemas.microsoft.com/office/word/2023/wordml/word16du" xmlns:w16sdtdh="http://schemas.microsoft.com/office/word/2020/wordml/sdtdatahash" xmlns:w16sdtfl="http://schemas.microsoft.com/office/word/2024/wordml/sdtformatlock" xmlns:w16se="http://schemas.microsoft.com/office/word/2015/wordml/symex" mc:Ignorable="w14 w15 w16se w16cid w16 w16cex w16sdtdh w16sdtfl w16du">
   <w:docDefaults>
     <w:rPrDefault>
       <w:rPr>
@@ -3318,7 +3651,7 @@
     <w:lsdException w:name="Table Web 2" w:semiHidden="1" w:unhideWhenUsed="1"/>
     <w:lsdException w:name="Table Web 3" w:semiHidden="1" w:unhideWhenUsed="1"/>
     <w:lsdException w:name="Balloon Text" w:semiHidden="1" w:unhideWhenUsed="1"/>
-    <w:lsdException w:name="Table Grid" w:uiPriority="59"/>
+    <w:lsdException w:name="Table Grid" w:uiPriority="39"/>
     <w:lsdException w:name="Table Theme" w:semiHidden="1" w:unhideWhenUsed="1"/>
     <w:lsdException w:name="Placeholder Text" w:semiHidden="1"/>
     <w:lsdException w:name="No Spacing" w:uiPriority="1" w:qFormat="1"/>
@@ -3544,12 +3877,11 @@
   <w:style w:type="paragraph" w:default="1" w:styleId="Normal">
     <w:name w:val="Normal"/>
     <w:qFormat/>
-    <w:rsid w:val="00E62B86"/>
+    <w:rsid w:val="00027C07"/>
   </w:style>
   <w:style w:type="character" w:default="1" w:styleId="DefaultParagraphFont">
     <w:name w:val="Default Paragraph Font"/>
     <w:uiPriority w:val="1"/>
-    <w:semiHidden/>
     <w:unhideWhenUsed/>
   </w:style>
   <w:style w:type="table" w:default="1" w:styleId="TableNormal">
@@ -3572,6 +3904,40 @@
     <w:uiPriority w:val="99"/>
     <w:semiHidden/>
     <w:unhideWhenUsed/>
+  </w:style>
+  <w:style w:type="paragraph" w:styleId="ListParagraph">
+    <w:name w:val="List Paragraph"/>
+    <w:basedOn w:val="Normal"/>
+    <w:uiPriority w:val="34"/>
+    <w:qFormat/>
+    <w:rsid w:val="00027C07"/>
+    <w:pPr>
+      <w:ind w:left="720"/>
+      <w:contextualSpacing/>
+    </w:pPr>
+    <w:rPr>
+      <w:rFonts w:ascii="Verdana" w:hAnsi="Verdana"/>
+      <w:sz w:val="20"/>
+    </w:rPr>
+  </w:style>
+  <w:style w:type="table" w:styleId="TableGrid">
+    <w:name w:val="Table Grid"/>
+    <w:basedOn w:val="TableNormal"/>
+    <w:uiPriority w:val="39"/>
+    <w:rsid w:val="00027C07"/>
+    <w:pPr>
+      <w:spacing w:after="0" w:line="240" w:lineRule="auto"/>
+    </w:pPr>
+    <w:tblPr>
+      <w:tblBorders>
+        <w:top w:val="single" w:sz="4" w:space="0" w:color="auto"/>
+        <w:left w:val="single" w:sz="4" w:space="0" w:color="auto"/>
+        <w:bottom w:val="single" w:sz="4" w:space="0" w:color="auto"/>
+        <w:right w:val="single" w:sz="4" w:space="0" w:color="auto"/>
+        <w:insideH w:val="single" w:sz="4" w:space="0" w:color="auto"/>
+        <w:insideV w:val="single" w:sz="4" w:space="0" w:color="auto"/>
+      </w:tblBorders>
+    </w:tblPr>
   </w:style>
 </w:styles>
 </file>

</xml_diff>